<commit_message>
feat: QR code sans Internet, contrôle général du code, routeur « La nuit du village », plein écran moins insistant
- QR code de connexion dessiné par le serveur (/api/qr.svg, npm qrcode) : plus aucune ressource externe
- Contrôle général : évènements orphelins (gameCycle, missionError, corbeauConfirm), phase fantôme
  « petiteFille », listes de phases de nuit unifiées (barre MJ pendant le Corbeau), écran de fin complet,
  ROLE_LABEL dédoublonné, libellés du mode autonome corrigés, code et CSS morts retirés
- Routeur GL.iNet Opal : Bridge Hue en 192.168.8.147, PC du jeu en 192.168.8.231 ; fiches Mise en place
  et Lumières, message du test des lumières à jour
- Plein écran demandé au clic « Rejoindre » et une fois après chaque reconnexion seulement
- Règle confirmée : le maire ne peut pas s'inclure dans sa mission (journal corrigé)

Co-Authored-By: Claude Opus 5.5 <noreply@anthropic.com>
</commit_message>
<xml_diff>
--- a/gestion/2 - Mise en place et lancement.docx
+++ b/gestion/2 - Mise en place et lancement.docx
@@ -248,9 +248,9 @@
         <w:tblLook w:val="04A0" w:firstRow="1" w:lastRow="0" w:firstColumn="1" w:lastColumn="0" w:noHBand="0" w:noVBand="1"/>
       </w:tblPr>
       <w:tblGrid>
-        <w:gridCol w:w="3834"/>
-        <w:gridCol w:w="3295"/>
-        <w:gridCol w:w="2494"/>
+        <w:gridCol w:w="3814"/>
+        <w:gridCol w:w="3326"/>
+        <w:gridCol w:w="2483"/>
       </w:tblGrid>
       <w:tr>
         <w:trPr>
@@ -258,7 +258,7 @@
         </w:trPr>
         <w:tc>
           <w:tcPr>
-            <w:tcW w:w="1992" w:type="pct"/>
+            <w:tcW w:w="1982" w:type="pct"/>
             <w:tcBorders>
               <w:top w:val="single" w:sz="6" w:space="0" w:color="A6A6A6"/>
               <w:left w:val="single" w:sz="6" w:space="0" w:color="A6A6A6"/>
@@ -298,7 +298,7 @@
         </w:tc>
         <w:tc>
           <w:tcPr>
-            <w:tcW w:w="1712" w:type="pct"/>
+            <w:tcW w:w="1728" w:type="pct"/>
             <w:tcBorders>
               <w:top w:val="single" w:sz="6" w:space="0" w:color="A6A6A6"/>
               <w:left w:val="single" w:sz="6" w:space="0" w:color="A6A6A6"/>
@@ -338,7 +338,7 @@
         </w:tc>
         <w:tc>
           <w:tcPr>
-            <w:tcW w:w="1296" w:type="pct"/>
+            <w:tcW w:w="1290" w:type="pct"/>
             <w:tcBorders>
               <w:top w:val="single" w:sz="6" w:space="0" w:color="A6A6A6"/>
               <w:left w:val="single" w:sz="6" w:space="0" w:color="A6A6A6"/>
@@ -380,7 +380,7 @@
       <w:tr>
         <w:tc>
           <w:tcPr>
-            <w:tcW w:w="1992" w:type="pct"/>
+            <w:tcW w:w="1982" w:type="pct"/>
             <w:tcBorders>
               <w:top w:val="single" w:sz="6" w:space="0" w:color="A6A6A6"/>
               <w:left w:val="single" w:sz="6" w:space="0" w:color="A6A6A6"/>
@@ -421,7 +421,7 @@
         </w:tc>
         <w:tc>
           <w:tcPr>
-            <w:tcW w:w="1712" w:type="pct"/>
+            <w:tcW w:w="1728" w:type="pct"/>
             <w:tcBorders>
               <w:top w:val="single" w:sz="6" w:space="0" w:color="A6A6A6"/>
               <w:left w:val="single" w:sz="6" w:space="0" w:color="A6A6A6"/>
@@ -456,7 +456,7 @@
         </w:tc>
         <w:tc>
           <w:tcPr>
-            <w:tcW w:w="1296" w:type="pct"/>
+            <w:tcW w:w="1290" w:type="pct"/>
             <w:tcBorders>
               <w:top w:val="single" w:sz="6" w:space="0" w:color="A6A6A6"/>
               <w:left w:val="single" w:sz="6" w:space="0" w:color="A6A6A6"/>
@@ -493,7 +493,7 @@
       <w:tr>
         <w:tc>
           <w:tcPr>
-            <w:tcW w:w="1992" w:type="pct"/>
+            <w:tcW w:w="1982" w:type="pct"/>
             <w:tcBorders>
               <w:top w:val="single" w:sz="6" w:space="0" w:color="A6A6A6"/>
               <w:left w:val="single" w:sz="6" w:space="0" w:color="A6A6A6"/>
@@ -522,13 +522,30 @@
                 <w:sz w:val="22"/>
                 <w:szCs w:val="22"/>
               </w:rPr>
-              <w:t>Une box ou un routeur Wi-Fi</w:t>
+              <w:t xml:space="preserve">Le routeur </w:t>
+            </w:r>
+            <w:r>
+              <w:rPr>
+                <w:rStyle w:val="lev"/>
+                <w:rFonts w:ascii="Calibri" w:eastAsia="Times New Roman" w:hAnsi="Calibri" w:cs="Calibri"/>
+                <w:sz w:val="22"/>
+                <w:szCs w:val="22"/>
+              </w:rPr>
+              <w:t>« La nuit du village »</w:t>
+            </w:r>
+            <w:r>
+              <w:rPr>
+                <w:rFonts w:ascii="Calibri" w:eastAsia="Times New Roman" w:hAnsi="Calibri" w:cs="Calibri"/>
+                <w:sz w:val="22"/>
+                <w:szCs w:val="22"/>
+              </w:rPr>
+              <w:t xml:space="preserve"> (GL.iNet Opal)</w:t>
             </w:r>
           </w:p>
         </w:tc>
         <w:tc>
           <w:tcPr>
-            <w:tcW w:w="1712" w:type="pct"/>
+            <w:tcW w:w="1728" w:type="pct"/>
             <w:tcBorders>
               <w:top w:val="single" w:sz="6" w:space="0" w:color="A6A6A6"/>
               <w:left w:val="single" w:sz="6" w:space="0" w:color="A6A6A6"/>
@@ -557,13 +574,13 @@
                 <w:sz w:val="22"/>
                 <w:szCs w:val="22"/>
               </w:rPr>
-              <w:t>Relie tout le monde</w:t>
+              <w:t>Crée le réseau Wi-Fi du jeu, chez toi comme chez un client</w:t>
             </w:r>
           </w:p>
         </w:tc>
         <w:tc>
           <w:tcPr>
-            <w:tcW w:w="1296" w:type="pct"/>
+            <w:tcW w:w="1290" w:type="pct"/>
             <w:tcBorders>
               <w:top w:val="single" w:sz="6" w:space="0" w:color="A6A6A6"/>
               <w:left w:val="single" w:sz="6" w:space="0" w:color="A6A6A6"/>
@@ -600,7 +617,7 @@
       <w:tr>
         <w:tc>
           <w:tcPr>
-            <w:tcW w:w="1992" w:type="pct"/>
+            <w:tcW w:w="1982" w:type="pct"/>
             <w:tcBorders>
               <w:top w:val="single" w:sz="6" w:space="0" w:color="A6A6A6"/>
               <w:left w:val="single" w:sz="6" w:space="0" w:color="A6A6A6"/>
@@ -635,7 +652,7 @@
         </w:tc>
         <w:tc>
           <w:tcPr>
-            <w:tcW w:w="1712" w:type="pct"/>
+            <w:tcW w:w="1728" w:type="pct"/>
             <w:tcBorders>
               <w:top w:val="single" w:sz="6" w:space="0" w:color="A6A6A6"/>
               <w:left w:val="single" w:sz="6" w:space="0" w:color="A6A6A6"/>
@@ -670,7 +687,7 @@
         </w:tc>
         <w:tc>
           <w:tcPr>
-            <w:tcW w:w="1296" w:type="pct"/>
+            <w:tcW w:w="1290" w:type="pct"/>
             <w:tcBorders>
               <w:top w:val="single" w:sz="6" w:space="0" w:color="A6A6A6"/>
               <w:left w:val="single" w:sz="6" w:space="0" w:color="A6A6A6"/>
@@ -707,7 +724,7 @@
       <w:tr>
         <w:tc>
           <w:tcPr>
-            <w:tcW w:w="1992" w:type="pct"/>
+            <w:tcW w:w="1982" w:type="pct"/>
             <w:tcBorders>
               <w:top w:val="single" w:sz="6" w:space="0" w:color="A6A6A6"/>
               <w:left w:val="single" w:sz="6" w:space="0" w:color="A6A6A6"/>
@@ -742,7 +759,7 @@
         </w:tc>
         <w:tc>
           <w:tcPr>
-            <w:tcW w:w="1712" w:type="pct"/>
+            <w:tcW w:w="1728" w:type="pct"/>
             <w:tcBorders>
               <w:top w:val="single" w:sz="6" w:space="0" w:color="A6A6A6"/>
               <w:left w:val="single" w:sz="6" w:space="0" w:color="A6A6A6"/>
@@ -777,7 +794,7 @@
         </w:tc>
         <w:tc>
           <w:tcPr>
-            <w:tcW w:w="1296" w:type="pct"/>
+            <w:tcW w:w="1290" w:type="pct"/>
             <w:tcBorders>
               <w:top w:val="single" w:sz="6" w:space="0" w:color="A6A6A6"/>
               <w:left w:val="single" w:sz="6" w:space="0" w:color="A6A6A6"/>
@@ -814,7 +831,7 @@
       <w:tr>
         <w:tc>
           <w:tcPr>
-            <w:tcW w:w="1992" w:type="pct"/>
+            <w:tcW w:w="1982" w:type="pct"/>
             <w:tcBorders>
               <w:top w:val="single" w:sz="6" w:space="0" w:color="A6A6A6"/>
               <w:left w:val="single" w:sz="6" w:space="0" w:color="A6A6A6"/>
@@ -849,7 +866,7 @@
         </w:tc>
         <w:tc>
           <w:tcPr>
-            <w:tcW w:w="1712" w:type="pct"/>
+            <w:tcW w:w="1728" w:type="pct"/>
             <w:tcBorders>
               <w:top w:val="single" w:sz="6" w:space="0" w:color="A6A6A6"/>
               <w:left w:val="single" w:sz="6" w:space="0" w:color="A6A6A6"/>
@@ -884,7 +901,7 @@
         </w:tc>
         <w:tc>
           <w:tcPr>
-            <w:tcW w:w="1296" w:type="pct"/>
+            <w:tcW w:w="1290" w:type="pct"/>
             <w:tcBorders>
               <w:top w:val="single" w:sz="6" w:space="0" w:color="A6A6A6"/>
               <w:left w:val="single" w:sz="6" w:space="0" w:color="A6A6A6"/>
@@ -921,7 +938,7 @@
       <w:tr>
         <w:tc>
           <w:tcPr>
-            <w:tcW w:w="1992" w:type="pct"/>
+            <w:tcW w:w="1982" w:type="pct"/>
             <w:tcBorders>
               <w:top w:val="single" w:sz="6" w:space="0" w:color="A6A6A6"/>
               <w:left w:val="single" w:sz="6" w:space="0" w:color="A6A6A6"/>
@@ -956,7 +973,7 @@
         </w:tc>
         <w:tc>
           <w:tcPr>
-            <w:tcW w:w="1712" w:type="pct"/>
+            <w:tcW w:w="1728" w:type="pct"/>
             <w:tcBorders>
               <w:top w:val="single" w:sz="6" w:space="0" w:color="A6A6A6"/>
               <w:left w:val="single" w:sz="6" w:space="0" w:color="A6A6A6"/>
@@ -991,7 +1008,7 @@
         </w:tc>
         <w:tc>
           <w:tcPr>
-            <w:tcW w:w="1296" w:type="pct"/>
+            <w:tcW w:w="1290" w:type="pct"/>
             <w:tcBorders>
               <w:top w:val="single" w:sz="6" w:space="0" w:color="A6A6A6"/>
               <w:left w:val="single" w:sz="6" w:space="0" w:color="A6A6A6"/>
@@ -1028,7 +1045,7 @@
       <w:tr>
         <w:tc>
           <w:tcPr>
-            <w:tcW w:w="1992" w:type="pct"/>
+            <w:tcW w:w="1982" w:type="pct"/>
             <w:tcBorders>
               <w:top w:val="single" w:sz="6" w:space="0" w:color="A6A6A6"/>
               <w:left w:val="single" w:sz="6" w:space="0" w:color="A6A6A6"/>
@@ -1063,7 +1080,7 @@
         </w:tc>
         <w:tc>
           <w:tcPr>
-            <w:tcW w:w="1712" w:type="pct"/>
+            <w:tcW w:w="1728" w:type="pct"/>
             <w:tcBorders>
               <w:top w:val="single" w:sz="6" w:space="0" w:color="A6A6A6"/>
               <w:left w:val="single" w:sz="6" w:space="0" w:color="A6A6A6"/>
@@ -1098,7 +1115,7 @@
         </w:tc>
         <w:tc>
           <w:tcPr>
-            <w:tcW w:w="1296" w:type="pct"/>
+            <w:tcW w:w="1290" w:type="pct"/>
             <w:tcBorders>
               <w:top w:val="single" w:sz="6" w:space="0" w:color="A6A6A6"/>
               <w:left w:val="single" w:sz="6" w:space="0" w:color="A6A6A6"/>
@@ -1135,7 +1152,7 @@
       <w:tr>
         <w:tc>
           <w:tcPr>
-            <w:tcW w:w="1992" w:type="pct"/>
+            <w:tcW w:w="1982" w:type="pct"/>
             <w:tcBorders>
               <w:top w:val="single" w:sz="6" w:space="0" w:color="A6A6A6"/>
               <w:left w:val="single" w:sz="6" w:space="0" w:color="A6A6A6"/>
@@ -1164,13 +1181,14 @@
                 <w:sz w:val="22"/>
                 <w:szCs w:val="22"/>
               </w:rPr>
+              <w:lastRenderedPageBreak/>
               <w:t>Des batteries externes et un ou deux téléphones de rechange</w:t>
             </w:r>
           </w:p>
         </w:tc>
         <w:tc>
           <w:tcPr>
-            <w:tcW w:w="1712" w:type="pct"/>
+            <w:tcW w:w="1728" w:type="pct"/>
             <w:tcBorders>
               <w:top w:val="single" w:sz="6" w:space="0" w:color="A6A6A6"/>
               <w:left w:val="single" w:sz="6" w:space="0" w:color="A6A6A6"/>
@@ -1205,7 +1223,7 @@
         </w:tc>
         <w:tc>
           <w:tcPr>
-            <w:tcW w:w="1296" w:type="pct"/>
+            <w:tcW w:w="1290" w:type="pct"/>
             <w:tcBorders>
               <w:top w:val="single" w:sz="6" w:space="0" w:color="A6A6A6"/>
               <w:left w:val="single" w:sz="6" w:space="0" w:color="A6A6A6"/>
@@ -1251,7 +1269,6 @@
         <w:rPr>
           <w:rFonts w:eastAsia="Times New Roman"/>
         </w:rPr>
-        <w:lastRenderedPageBreak/>
         <w:t>Avant la soirée (une seule fois sur un nouvel ordinateur ou un nouveau réseau)</w:t>
       </w:r>
     </w:p>
@@ -1413,15 +1430,7 @@
           <w:sz w:val="22"/>
           <w:szCs w:val="22"/>
         </w:rPr>
-        <w:t xml:space="preserve"> : lancer le jeu (étape 1 ci-dessous), ouvrir l'</w:t>
-      </w:r>
-      <w:r>
-        <w:rPr>
-          <w:rFonts w:ascii="Calibri" w:eastAsia="Times New Roman" w:hAnsi="Calibri" w:cs="Calibri"/>
-          <w:sz w:val="22"/>
-          <w:szCs w:val="22"/>
-        </w:rPr>
-        <w:t>adresse des joueurs sur ton propre téléphone. Si la page s'ouvre, tout est bon.</w:t>
+        <w:t xml:space="preserve"> : lancer le jeu (étape 1 ci-dessous), ouvrir l'adresse des joueurs sur ton propre téléphone. Si la page s'ouvre, tout est bon.</w:t>
       </w:r>
     </w:p>
     <w:p>
@@ -1628,7 +1637,15 @@
           <w:sz w:val="22"/>
           <w:szCs w:val="22"/>
         </w:rPr>
-        <w:t xml:space="preserve"> pendant la partie : la fermer arrête le jeu.</w:t>
+        <w:t xml:space="preserve"> </w:t>
+      </w:r>
+      <w:r>
+        <w:rPr>
+          <w:rFonts w:ascii="Calibri" w:eastAsia="Times New Roman" w:hAnsi="Calibri" w:cs="Calibri"/>
+          <w:sz w:val="22"/>
+          <w:szCs w:val="22"/>
+        </w:rPr>
+        <w:t>pendant la partie : la fermer arrête le jeu.</w:t>
       </w:r>
     </w:p>
     <w:p>
@@ -1681,15 +1698,7 @@
           <w:sz w:val="22"/>
           <w:szCs w:val="22"/>
         </w:rPr>
-        <w:t xml:space="preserve"> </w:t>
-      </w:r>
-      <w:r>
-        <w:rPr>
-          <w:rFonts w:ascii="Calibri" w:eastAsia="Times New Roman" w:hAnsi="Calibri" w:cs="Calibri"/>
-          <w:sz w:val="22"/>
-          <w:szCs w:val="22"/>
-        </w:rPr>
-        <w:t>dans le navigateur (Chrome conseillé), passe en plein écran.</w:t>
+        <w:t xml:space="preserve"> dans le navigateur (Chrome conseillé), passe en plein écran.</w:t>
       </w:r>
     </w:p>
     <w:p>
@@ -1974,6 +1983,7 @@
           <w:sz w:val="22"/>
           <w:szCs w:val="22"/>
         </w:rPr>
+        <w:lastRenderedPageBreak/>
         <w:t>Coche « Mission » si tu veux les missions.</w:t>
       </w:r>
     </w:p>
@@ -2013,7 +2023,15 @@
           <w:sz w:val="22"/>
           <w:szCs w:val="22"/>
         </w:rPr>
-        <w:t xml:space="preserve"> coché (c'est le mode prévu : c'est toi qui ouvres le vote).</w:t>
+        <w:t xml:space="preserve"> coché (c'est le mode prévu : c'</w:t>
+      </w:r>
+      <w:r>
+        <w:rPr>
+          <w:rFonts w:ascii="Calibri" w:eastAsia="Times New Roman" w:hAnsi="Calibri" w:cs="Calibri"/>
+          <w:sz w:val="22"/>
+          <w:szCs w:val="22"/>
+        </w:rPr>
+        <w:t>est toi qui ouvres le vote).</w:t>
       </w:r>
     </w:p>
     <w:p>
@@ -2164,7 +2182,6 @@
           <w:sz w:val="22"/>
           <w:szCs w:val="22"/>
         </w:rPr>
-        <w:lastRenderedPageBreak/>
         <w:t>Élection du maire</w:t>
       </w:r>
       <w:r>
@@ -2248,7 +2265,15 @@
           <w:sz w:val="22"/>
           <w:szCs w:val="22"/>
         </w:rPr>
-        <w:t xml:space="preserve"> : son nom et sa règle restent affichés en haut de ton écran toute la journée ; « </w:t>
+        <w:t xml:space="preserve"> </w:t>
+      </w:r>
+      <w:r>
+        <w:rPr>
+          <w:rFonts w:ascii="Calibri" w:eastAsia="Times New Roman" w:hAnsi="Calibri" w:cs="Calibri"/>
+          <w:sz w:val="22"/>
+          <w:szCs w:val="22"/>
+        </w:rPr>
+        <w:t xml:space="preserve">: son nom et sa règle restent affichés en haut de ton écran toute la journée ; « </w:t>
       </w:r>
       <w:r>
         <w:rPr>
@@ -2295,15 +2320,7 @@
           <w:sz w:val="22"/>
           <w:szCs w:val="22"/>
         </w:rPr>
-        <w:t xml:space="preserve"> </w:t>
-      </w:r>
-      <w:r>
-        <w:rPr>
-          <w:rFonts w:ascii="Calibri" w:eastAsia="Times New Roman" w:hAnsi="Calibri" w:cs="Calibri"/>
-          <w:sz w:val="22"/>
-          <w:szCs w:val="22"/>
-        </w:rPr>
-        <w:t xml:space="preserve">: au début de la nuit, puis à la fin de chaque rôle, tous les écrans affichent « Garde les yeux fermés » et un grand bouton </w:t>
+        <w:t xml:space="preserve"> : au début de la nuit, puis à la fin de chaque rôle, tous les écrans affichent « Garde les yeux fermés » et un grand bouton </w:t>
       </w:r>
       <w:r>
         <w:rPr>
@@ -2356,7 +2373,15 @@
           <w:sz w:val="22"/>
           <w:szCs w:val="22"/>
         </w:rPr>
-        <w:t xml:space="preserve"> apparaît chez toi, avec le nom du rôle qui suit. Vérifie que tout le monde a bien les yeux fermés, puis clique : le rôle suivant se réveille. (Si personne ne clique pendant 3 minutes, la nuit continue d'elle-même.)</w:t>
+        <w:t xml:space="preserve"> apparaît chez toi, avec le nom du rôle qui suit. Vérifie que tout le monde a bien les yeux fermés, puis clique : le rôle suivant se réveille. (Si personne ne clique pendant 3 minutes, la nuit continue d'</w:t>
+      </w:r>
+      <w:r>
+        <w:rPr>
+          <w:rFonts w:ascii="Calibri" w:eastAsia="Times New Roman" w:hAnsi="Calibri" w:cs="Calibri"/>
+          <w:sz w:val="22"/>
+          <w:szCs w:val="22"/>
+        </w:rPr>
+        <w:t>elle-même.)</w:t>
       </w:r>
     </w:p>
     <w:p>
@@ -2395,15 +2420,7 @@
           <w:sz w:val="22"/>
           <w:szCs w:val="22"/>
         </w:rPr>
-        <w:t xml:space="preserve"> ont 20 secondes pour se reconnaître : le décompte démarre tout seul quand tu cliques sur « Passer à l'</w:t>
-      </w:r>
-      <w:r>
-        <w:rPr>
-          <w:rFonts w:ascii="Calibri" w:eastAsia="Times New Roman" w:hAnsi="Calibri" w:cs="Calibri"/>
-          <w:sz w:val="22"/>
-          <w:szCs w:val="22"/>
-        </w:rPr>
-        <w:t>étape suivante » pour les réveiller. Ensuite, la nuit marque la même pause que pour les autres rôles.</w:t>
+        <w:t xml:space="preserve"> ont 20 secondes pour se reconnaître : le décompte démarre tout seul quand tu cliques sur « Passer à l'étape suivante » pour les réveiller. Ensuite, la nuit marque la même pause que pour les autres rôles.</w:t>
       </w:r>
     </w:p>
     <w:p>
@@ -2549,7 +2566,7 @@
         <w:rPr>
           <w:rFonts w:eastAsia="Times New Roman"/>
         </w:rPr>
-        <w:t>Jouer ailleurs que chez soi</w:t>
+        <w:t>Le réseau du jeu : le routeur « La nuit du village »</w:t>
       </w:r>
     </w:p>
     <w:p>
@@ -2557,19 +2574,25 @@
         <w:pStyle w:val="NormalWeb"/>
       </w:pPr>
       <w:r>
-        <w:t xml:space="preserve">Les Wi-Fi d'hôtels, de bars, de gîtes ou les réseaux « invités » </w:t>
-      </w:r>
-      <w:r>
-        <w:rPr>
-          <w:rStyle w:val="lev"/>
-        </w:rPr>
-        <w:t>empêchent souvent les appareils de se voir entre eux</w:t>
-      </w:r>
-      <w:r>
-        <w:t xml:space="preserve"> (c'</w:t>
-      </w:r>
-      <w:r>
-        <w:t>est une protection appelée « isolation des clients ») : les téléphones n'arrivent alors pas à ouvrir la page du jeu, même si Internet marche.</w:t>
+        <w:t xml:space="preserve">Le routeur </w:t>
+      </w:r>
+      <w:r>
+        <w:rPr>
+          <w:rStyle w:val="lev"/>
+        </w:rPr>
+        <w:t>GL.iNet Opal</w:t>
+      </w:r>
+      <w:r>
+        <w:t xml:space="preserve"> crée son propre réseau Wi-Fi, </w:t>
+      </w:r>
+      <w:r>
+        <w:rPr>
+          <w:rStyle w:val="lev"/>
+        </w:rPr>
+        <w:t>« La nuit du village »</w:t>
+      </w:r>
+      <w:r>
+        <w:t>. L'ordinateur, la tablette du MJ et les téléphones des joueurs s'y connectent tous. On ne dépend donc jamais du Wi-Fi du lieu : les Wi-Fi d'hôtels, de bars ou les réseaux « invités » empêchent souvent les appareils de se voir entre eux.</w:t>
       </w:r>
     </w:p>
     <w:p>
@@ -2577,16 +2600,10 @@
         <w:pStyle w:val="NormalWeb"/>
       </w:pPr>
       <w:r>
-        <w:t xml:space="preserve">La solution fiable : </w:t>
-      </w:r>
-      <w:r>
-        <w:rPr>
-          <w:rStyle w:val="lev"/>
-        </w:rPr>
-        <w:t>apporter son propre réseau</w:t>
-      </w:r>
-      <w:r>
-        <w:t>.</w:t>
+        <w:rPr>
+          <w:rStyle w:val="lev"/>
+        </w:rPr>
+        <w:t>Les branchements :</w:t>
       </w:r>
     </w:p>
     <w:p>
@@ -2609,15 +2626,32 @@
           <w:sz w:val="22"/>
           <w:szCs w:val="22"/>
         </w:rPr>
-        <w:t>Un petit routeur de voyage</w:t>
-      </w:r>
-      <w:r>
-        <w:rPr>
-          <w:rFonts w:ascii="Calibri" w:eastAsia="Times New Roman" w:hAnsi="Calibri" w:cs="Calibri"/>
-          <w:sz w:val="22"/>
-          <w:szCs w:val="22"/>
-        </w:rPr>
-        <w:t xml:space="preserve"> (environ 30 à 60 €) : on le branche, l'ordinateur, la tablette et les téléphones s'y connectent. C'est la solution à prévoir dans un kit de location.</w:t>
+        <w:t>Bridge Hue</w:t>
+      </w:r>
+      <w:r>
+        <w:rPr>
+          <w:rFonts w:ascii="Calibri" w:eastAsia="Times New Roman" w:hAnsi="Calibri" w:cs="Calibri"/>
+          <w:sz w:val="22"/>
+          <w:szCs w:val="22"/>
+        </w:rPr>
+        <w:t xml:space="preserve"> → une des prises </w:t>
+      </w:r>
+      <w:r>
+        <w:rPr>
+          <w:rStyle w:val="lev"/>
+          <w:rFonts w:ascii="Calibri" w:eastAsia="Times New Roman" w:hAnsi="Calibri" w:cs="Calibri"/>
+          <w:sz w:val="22"/>
+          <w:szCs w:val="22"/>
+        </w:rPr>
+        <w:t>LAN</w:t>
+      </w:r>
+      <w:r>
+        <w:rPr>
+          <w:rFonts w:ascii="Calibri" w:eastAsia="Times New Roman" w:hAnsi="Calibri" w:cs="Calibri"/>
+          <w:sz w:val="22"/>
+          <w:szCs w:val="22"/>
+        </w:rPr>
+        <w:t xml:space="preserve"> du routeur (pas celle avec le globe).</w:t>
       </w:r>
     </w:p>
     <w:p>
@@ -2640,15 +2674,57 @@
           <w:sz w:val="22"/>
           <w:szCs w:val="22"/>
         </w:rPr>
-        <w:t>Dépannage</w:t>
-      </w:r>
-      <w:r>
-        <w:rPr>
-          <w:rFonts w:ascii="Calibri" w:eastAsia="Times New Roman" w:hAnsi="Calibri" w:cs="Calibri"/>
-          <w:sz w:val="22"/>
-          <w:szCs w:val="22"/>
-        </w:rPr>
-        <w:t xml:space="preserve"> : le partage de connexion d'un téléphone fonctionne aussi pour quelques joueurs, mais il est moins stable avec beaucoup d'appareils.</w:t>
+        <w:t>Chez toi</w:t>
+      </w:r>
+      <w:r>
+        <w:rPr>
+          <w:rFonts w:ascii="Calibri" w:eastAsia="Times New Roman" w:hAnsi="Calibri" w:cs="Calibri"/>
+          <w:sz w:val="22"/>
+          <w:szCs w:val="22"/>
+        </w:rPr>
+        <w:t xml:space="preserve"> : un câble de la </w:t>
+      </w:r>
+      <w:r>
+        <w:rPr>
+          <w:rStyle w:val="lev"/>
+          <w:rFonts w:ascii="Calibri" w:eastAsia="Times New Roman" w:hAnsi="Calibri" w:cs="Calibri"/>
+          <w:sz w:val="22"/>
+          <w:szCs w:val="22"/>
+        </w:rPr>
+        <w:t>box SFR</w:t>
+      </w:r>
+      <w:r>
+        <w:rPr>
+          <w:rFonts w:ascii="Calibri" w:eastAsia="Times New Roman" w:hAnsi="Calibri" w:cs="Calibri"/>
+          <w:sz w:val="22"/>
+          <w:szCs w:val="22"/>
+        </w:rPr>
+        <w:t xml:space="preserve"> vers la prise </w:t>
+      </w:r>
+      <w:r>
+        <w:rPr>
+          <w:rStyle w:val="lev"/>
+          <w:rFonts w:ascii="Calibri" w:eastAsia="Times New Roman" w:hAnsi="Calibri" w:cs="Calibri"/>
+          <w:sz w:val="22"/>
+          <w:szCs w:val="22"/>
+        </w:rPr>
+        <w:t>WAN</w:t>
+      </w:r>
+      <w:r>
+        <w:rPr>
+          <w:rFonts w:ascii="Calibri" w:eastAsia="Times New Roman" w:hAnsi="Calibri" w:cs="Calibri"/>
+          <w:sz w:val="22"/>
+          <w:szCs w:val="22"/>
+        </w:rPr>
+        <w:t xml:space="preserve"> du routeur (celle avec le globe). Le routeur partage alors l'</w:t>
+      </w:r>
+      <w:r>
+        <w:rPr>
+          <w:rFonts w:ascii="Calibri" w:eastAsia="Times New Roman" w:hAnsi="Calibri" w:cs="Calibri"/>
+          <w:sz w:val="22"/>
+          <w:szCs w:val="22"/>
+        </w:rPr>
+        <w:t>Internet de la box.</w:t>
       </w:r>
     </w:p>
     <w:p>
@@ -2671,15 +2747,334 @@
           <w:sz w:val="22"/>
           <w:szCs w:val="22"/>
         </w:rPr>
-        <w:t>Lumières</w:t>
-      </w:r>
-      <w:r>
-        <w:rPr>
-          <w:rFonts w:ascii="Calibri" w:eastAsia="Times New Roman" w:hAnsi="Calibri" w:cs="Calibri"/>
-          <w:sz w:val="22"/>
-          <w:szCs w:val="22"/>
-        </w:rPr>
-        <w:t xml:space="preserve"> : le Bridge Hue doit être sur le même réseau que l'ordinateur. Sur un nouveau réseau, son adresse change → demande à Claude de mettre à jour la configuration des lumières (voir la fiche lumières).</w:t>
+        <w:t>Chez un client</w:t>
+      </w:r>
+      <w:r>
+        <w:rPr>
+          <w:rFonts w:ascii="Calibri" w:eastAsia="Times New Roman" w:hAnsi="Calibri" w:cs="Calibri"/>
+          <w:sz w:val="22"/>
+          <w:szCs w:val="22"/>
+        </w:rPr>
+        <w:t xml:space="preserve"> : rien dans la prise WAN. Le jeu fonctionne </w:t>
+      </w:r>
+      <w:r>
+        <w:rPr>
+          <w:rStyle w:val="lev"/>
+          <w:rFonts w:ascii="Calibri" w:eastAsia="Times New Roman" w:hAnsi="Calibri" w:cs="Calibri"/>
+          <w:sz w:val="22"/>
+          <w:szCs w:val="22"/>
+        </w:rPr>
+        <w:t>sans Internet</w:t>
+      </w:r>
+      <w:r>
+        <w:rPr>
+          <w:rFonts w:ascii="Calibri" w:eastAsia="Times New Roman" w:hAnsi="Calibri" w:cs="Calibri"/>
+          <w:sz w:val="22"/>
+          <w:szCs w:val="22"/>
+        </w:rPr>
+        <w:t>.</w:t>
+      </w:r>
+    </w:p>
+    <w:p>
+      <w:pPr>
+        <w:numPr>
+          <w:ilvl w:val="0"/>
+          <w:numId w:val="9"/>
+        </w:numPr>
+        <w:spacing w:before="100" w:beforeAutospacing="1" w:after="100" w:afterAutospacing="1"/>
+        <w:rPr>
+          <w:rFonts w:ascii="Calibri" w:eastAsia="Times New Roman" w:hAnsi="Calibri" w:cs="Calibri"/>
+          <w:sz w:val="22"/>
+          <w:szCs w:val="22"/>
+        </w:rPr>
+      </w:pPr>
+      <w:r>
+        <w:rPr>
+          <w:rFonts w:ascii="Calibri" w:eastAsia="Times New Roman" w:hAnsi="Calibri" w:cs="Calibri"/>
+          <w:sz w:val="22"/>
+          <w:szCs w:val="22"/>
+        </w:rPr>
+        <w:t xml:space="preserve">Le routeur s'alimente par </w:t>
+      </w:r>
+      <w:r>
+        <w:rPr>
+          <w:rStyle w:val="lev"/>
+          <w:rFonts w:ascii="Calibri" w:eastAsia="Times New Roman" w:hAnsi="Calibri" w:cs="Calibri"/>
+          <w:sz w:val="22"/>
+          <w:szCs w:val="22"/>
+        </w:rPr>
+        <w:t>USB-C</w:t>
+      </w:r>
+      <w:r>
+        <w:rPr>
+          <w:rFonts w:ascii="Calibri" w:eastAsia="Times New Roman" w:hAnsi="Calibri" w:cs="Calibri"/>
+          <w:sz w:val="22"/>
+          <w:szCs w:val="22"/>
+        </w:rPr>
+        <w:t xml:space="preserve"> : une prise ou une batterie externe.</w:t>
+      </w:r>
+    </w:p>
+    <w:p>
+      <w:pPr>
+        <w:pStyle w:val="NormalWeb"/>
+      </w:pPr>
+      <w:r>
+        <w:rPr>
+          <w:rStyle w:val="lev"/>
+        </w:rPr>
+        <w:t>Des adresses fixes</w:t>
+      </w:r>
+      <w:r>
+        <w:t xml:space="preserve"> (réservées dans le routeur) :</w:t>
+      </w:r>
+    </w:p>
+    <w:p>
+      <w:pPr>
+        <w:numPr>
+          <w:ilvl w:val="0"/>
+          <w:numId w:val="10"/>
+        </w:numPr>
+        <w:spacing w:before="100" w:beforeAutospacing="1" w:after="100" w:afterAutospacing="1"/>
+        <w:rPr>
+          <w:rFonts w:ascii="Calibri" w:eastAsia="Times New Roman" w:hAnsi="Calibri" w:cs="Calibri"/>
+          <w:sz w:val="22"/>
+          <w:szCs w:val="22"/>
+        </w:rPr>
+      </w:pPr>
+      <w:r>
+        <w:rPr>
+          <w:rStyle w:val="lev"/>
+          <w:rFonts w:ascii="Calibri" w:eastAsia="Times New Roman" w:hAnsi="Calibri" w:cs="Calibri"/>
+          <w:sz w:val="22"/>
+          <w:szCs w:val="22"/>
+        </w:rPr>
+        <w:t>Le jeu</w:t>
+      </w:r>
+      <w:r>
+        <w:rPr>
+          <w:rFonts w:ascii="Calibri" w:eastAsia="Times New Roman" w:hAnsi="Calibri" w:cs="Calibri"/>
+          <w:sz w:val="22"/>
+          <w:szCs w:val="22"/>
+        </w:rPr>
+        <w:t xml:space="preserve"> est toujours à l'adresse </w:t>
+      </w:r>
+      <w:r>
+        <w:rPr>
+          <w:rStyle w:val="CodeHTML"/>
+          <w:b/>
+          <w:bCs/>
+        </w:rPr>
+        <w:t>http://192.168.8.231:3000</w:t>
+      </w:r>
+      <w:r>
+        <w:rPr>
+          <w:rFonts w:ascii="Calibri" w:eastAsia="Times New Roman" w:hAnsi="Calibri" w:cs="Calibri"/>
+          <w:sz w:val="22"/>
+          <w:szCs w:val="22"/>
+        </w:rPr>
+        <w:t xml:space="preserve"> : un QR code imprimé avec cette adresse marche partout.</w:t>
+      </w:r>
+    </w:p>
+    <w:p>
+      <w:pPr>
+        <w:numPr>
+          <w:ilvl w:val="0"/>
+          <w:numId w:val="10"/>
+        </w:numPr>
+        <w:spacing w:before="100" w:beforeAutospacing="1" w:after="100" w:afterAutospacing="1"/>
+        <w:rPr>
+          <w:rFonts w:ascii="Calibri" w:eastAsia="Times New Roman" w:hAnsi="Calibri" w:cs="Calibri"/>
+          <w:sz w:val="22"/>
+          <w:szCs w:val="22"/>
+        </w:rPr>
+      </w:pPr>
+      <w:r>
+        <w:rPr>
+          <w:rStyle w:val="lev"/>
+          <w:rFonts w:ascii="Calibri" w:eastAsia="Times New Roman" w:hAnsi="Calibri" w:cs="Calibri"/>
+          <w:sz w:val="22"/>
+          <w:szCs w:val="22"/>
+        </w:rPr>
+        <w:t>Le Bridge Hue</w:t>
+      </w:r>
+      <w:r>
+        <w:rPr>
+          <w:rFonts w:ascii="Calibri" w:eastAsia="Times New Roman" w:hAnsi="Calibri" w:cs="Calibri"/>
+          <w:sz w:val="22"/>
+          <w:szCs w:val="22"/>
+        </w:rPr>
+        <w:t xml:space="preserve"> est toujours en </w:t>
+      </w:r>
+      <w:r>
+        <w:rPr>
+          <w:rStyle w:val="CodeHTML"/>
+        </w:rPr>
+        <w:t>192.168.8.147</w:t>
+      </w:r>
+      <w:r>
+        <w:rPr>
+          <w:rFonts w:ascii="Calibri" w:eastAsia="Times New Roman" w:hAnsi="Calibri" w:cs="Calibri"/>
+          <w:sz w:val="22"/>
+          <w:szCs w:val="22"/>
+        </w:rPr>
+        <w:t xml:space="preserve"> : les lumières n'ont jamais à être reconfigurées.</w:t>
+      </w:r>
+    </w:p>
+    <w:p>
+      <w:pPr>
+        <w:numPr>
+          <w:ilvl w:val="0"/>
+          <w:numId w:val="10"/>
+        </w:numPr>
+        <w:spacing w:before="100" w:beforeAutospacing="1" w:after="100" w:afterAutospacing="1"/>
+        <w:rPr>
+          <w:rFonts w:ascii="Calibri" w:eastAsia="Times New Roman" w:hAnsi="Calibri" w:cs="Calibri"/>
+          <w:sz w:val="22"/>
+          <w:szCs w:val="22"/>
+        </w:rPr>
+      </w:pPr>
+      <w:r>
+        <w:rPr>
+          <w:rStyle w:val="lev"/>
+          <w:rFonts w:ascii="Calibri" w:eastAsia="Times New Roman" w:hAnsi="Calibri" w:cs="Calibri"/>
+          <w:sz w:val="22"/>
+          <w:szCs w:val="22"/>
+        </w:rPr>
+        <w:t>Les réglages du routeur</w:t>
+      </w:r>
+      <w:r>
+        <w:rPr>
+          <w:rFonts w:ascii="Calibri" w:eastAsia="Times New Roman" w:hAnsi="Calibri" w:cs="Calibri"/>
+          <w:sz w:val="22"/>
+          <w:szCs w:val="22"/>
+        </w:rPr>
+        <w:t xml:space="preserve"> sont à l'adresse </w:t>
+      </w:r>
+      <w:r>
+        <w:rPr>
+          <w:rStyle w:val="CodeHTML"/>
+        </w:rPr>
+        <w:t>192.168.8.1</w:t>
+      </w:r>
+      <w:r>
+        <w:rPr>
+          <w:rFonts w:ascii="Calibri" w:eastAsia="Times New Roman" w:hAnsi="Calibri" w:cs="Calibri"/>
+          <w:sz w:val="22"/>
+          <w:szCs w:val="22"/>
+        </w:rPr>
+        <w:t xml:space="preserve"> (garde le mot de passe d'</w:t>
+      </w:r>
+      <w:r>
+        <w:rPr>
+          <w:rFonts w:ascii="Calibri" w:eastAsia="Times New Roman" w:hAnsi="Calibri" w:cs="Calibri"/>
+          <w:sz w:val="22"/>
+          <w:szCs w:val="22"/>
+        </w:rPr>
+        <w:t xml:space="preserve">administration dans ton dossier </w:t>
+      </w:r>
+      <w:r>
+        <w:rPr>
+          <w:rStyle w:val="CodeHTML"/>
+        </w:rPr>
+        <w:t>prive</w:t>
+      </w:r>
+      <w:r>
+        <w:rPr>
+          <w:rFonts w:ascii="Calibri" w:eastAsia="Times New Roman" w:hAnsi="Calibri" w:cs="Calibri"/>
+          <w:sz w:val="22"/>
+          <w:szCs w:val="22"/>
+        </w:rPr>
+        <w:t>).</w:t>
+      </w:r>
+    </w:p>
+    <w:p>
+      <w:pPr>
+        <w:pStyle w:val="NormalWeb"/>
+      </w:pPr>
+      <w:r>
+        <w:rPr>
+          <w:rStyle w:val="lev"/>
+        </w:rPr>
+        <w:t>À savoir :</w:t>
+      </w:r>
+    </w:p>
+    <w:p>
+      <w:pPr>
+        <w:numPr>
+          <w:ilvl w:val="0"/>
+          <w:numId w:val="11"/>
+        </w:numPr>
+        <w:spacing w:before="100" w:beforeAutospacing="1" w:after="100" w:afterAutospacing="1"/>
+        <w:rPr>
+          <w:rFonts w:ascii="Calibri" w:eastAsia="Times New Roman" w:hAnsi="Calibri" w:cs="Calibri"/>
+          <w:sz w:val="22"/>
+          <w:szCs w:val="22"/>
+        </w:rPr>
+      </w:pPr>
+      <w:r>
+        <w:rPr>
+          <w:rStyle w:val="lev"/>
+          <w:rFonts w:ascii="Calibri" w:eastAsia="Times New Roman" w:hAnsi="Calibri" w:cs="Calibri"/>
+          <w:sz w:val="22"/>
+          <w:szCs w:val="22"/>
+        </w:rPr>
+        <w:t>À la maison, pour avoir les lumières</w:t>
+      </w:r>
+      <w:r>
+        <w:rPr>
+          <w:rFonts w:ascii="Calibri" w:eastAsia="Times New Roman" w:hAnsi="Calibri" w:cs="Calibri"/>
+          <w:sz w:val="22"/>
+          <w:szCs w:val="22"/>
+        </w:rPr>
+        <w:t>, l'ordinateur doit être connecté à « La nuit du village » : sur le Wi-Fi de la box, il ne voit pas le Bridge.</w:t>
+      </w:r>
+    </w:p>
+    <w:p>
+      <w:pPr>
+        <w:numPr>
+          <w:ilvl w:val="0"/>
+          <w:numId w:val="11"/>
+        </w:numPr>
+        <w:spacing w:before="100" w:beforeAutospacing="1" w:after="100" w:afterAutospacing="1"/>
+        <w:rPr>
+          <w:rFonts w:ascii="Calibri" w:eastAsia="Times New Roman" w:hAnsi="Calibri" w:cs="Calibri"/>
+          <w:sz w:val="22"/>
+          <w:szCs w:val="22"/>
+        </w:rPr>
+      </w:pPr>
+      <w:r>
+        <w:rPr>
+          <w:rStyle w:val="lev"/>
+          <w:rFonts w:ascii="Calibri" w:eastAsia="Times New Roman" w:hAnsi="Calibri" w:cs="Calibri"/>
+          <w:sz w:val="22"/>
+          <w:szCs w:val="22"/>
+        </w:rPr>
+        <w:t>Pour faire entrer les joueurs sur le Wi-Fi</w:t>
+      </w:r>
+      <w:r>
+        <w:rPr>
+          <w:rFonts w:ascii="Calibri" w:eastAsia="Times New Roman" w:hAnsi="Calibri" w:cs="Calibri"/>
+          <w:sz w:val="22"/>
+          <w:szCs w:val="22"/>
+        </w:rPr>
+        <w:t xml:space="preserve"> sans dicter le mot de passe : sur un téléphone Android connecté à « La nuit du village », Paramètres → Wi-Fi → le réseau → </w:t>
+      </w:r>
+      <w:r>
+        <w:rPr>
+          <w:rStyle w:val="lev"/>
+          <w:rFonts w:ascii="Calibri" w:eastAsia="Times New Roman" w:hAnsi="Calibri" w:cs="Calibri"/>
+          <w:sz w:val="22"/>
+          <w:szCs w:val="22"/>
+        </w:rPr>
+        <w:t>Partager</w:t>
+      </w:r>
+      <w:r>
+        <w:rPr>
+          <w:rFonts w:ascii="Calibri" w:eastAsia="Times New Roman" w:hAnsi="Calibri" w:cs="Calibri"/>
+          <w:sz w:val="22"/>
+          <w:szCs w:val="22"/>
+        </w:rPr>
+        <w:t xml:space="preserve"> affiche un QR code que les autres scannent.</w:t>
       </w:r>
     </w:p>
     <w:p>
@@ -3126,15 +3521,7 @@
                 <w:sz w:val="22"/>
                 <w:szCs w:val="22"/>
               </w:rPr>
-              <w:t xml:space="preserve"> que l'</w:t>
-            </w:r>
-            <w:r>
-              <w:rPr>
-                <w:rFonts w:ascii="Calibri" w:eastAsia="Times New Roman" w:hAnsi="Calibri" w:cs="Calibri"/>
-                <w:sz w:val="22"/>
-                <w:szCs w:val="22"/>
-              </w:rPr>
-              <w:t>ordinateur (pas en 4G/5G). Vérifie que le réseau est « privé » et que Node.js est autorisé dans le pare-feu.</w:t>
+              <w:t xml:space="preserve"> que l'ordinateur (pas en 4G/5G). Vérifie que le réseau est « privé » et que Node.js est autorisé dans le pare-feu.</w:t>
             </w:r>
           </w:p>
         </w:tc>
@@ -3206,7 +3593,15 @@
                 <w:sz w:val="22"/>
                 <w:szCs w:val="22"/>
               </w:rPr>
-              <w:t>L'ordinateur a plusieurs connexions (VPN, câble + Wi-Fi…). Coupe le VPN, ou tape à la main l'adresse « IP locale » affichée dans la fenêtre noire.</w:t>
+              <w:t>L'ordinateur a plusieurs connexions (VPN, câble + Wi-Fi…). Coupe le VPN, ou tape à la main l'</w:t>
+            </w:r>
+            <w:r>
+              <w:rPr>
+                <w:rFonts w:ascii="Calibri" w:eastAsia="Times New Roman" w:hAnsi="Calibri" w:cs="Calibri"/>
+                <w:sz w:val="22"/>
+                <w:szCs w:val="22"/>
+              </w:rPr>
+              <w:t>adresse « IP locale » affichée dans la fenêtre noire.</w:t>
             </w:r>
           </w:p>
         </w:tc>
@@ -3470,7 +3865,15 @@
                 <w:sz w:val="22"/>
                 <w:szCs w:val="22"/>
               </w:rPr>
-              <w:t>Touche l'écran de la tablette MJ, vérifie le volume et l'enceinte, vérifie le bouton narration (</w:t>
+              <w:t>Touche l'écran de la tablette MJ, vérifie le volume et l'</w:t>
+            </w:r>
+            <w:r>
+              <w:rPr>
+                <w:rFonts w:ascii="Calibri" w:eastAsia="Times New Roman" w:hAnsi="Calibri" w:cs="Calibri"/>
+                <w:sz w:val="22"/>
+                <w:szCs w:val="22"/>
+              </w:rPr>
+              <w:t>enceinte, vérifie le bouton narration (</w:t>
             </w:r>
             <w:r>
               <w:rPr>
@@ -3705,7 +4108,10 @@
         <w:t>sur le Wi-Fi ou le routeur qui servira le jour J</w:t>
       </w:r>
       <w:r>
-        <w:t>, vérifier les lumières et le son. C'est le seul moyen d'éviter une mauvaise surprise réseau devant les clients.</w:t>
+        <w:t>, vérifier les lumières et le son. C'</w:t>
+      </w:r>
+      <w:r>
+        <w:t>est le seul moyen d'éviter une mauvaise surprise réseau devant les clients.</w:t>
       </w:r>
     </w:p>
     <w:p>
@@ -3753,7 +4159,10 @@
         <w:t>un onglet par joueur</w:t>
       </w:r>
       <w:r>
-        <w:t xml:space="preserve"> dans le navigateur de l'ordinateur. Les onglets que tu ne regardes pas sont mis en veille par le navigateur et affichent « Connexion perdue » au bout d'un moment : c'est normal, ils se reconnectent sous le bon prénom dès que tu reviens dessus.</w:t>
+        <w:t xml:space="preserve"> dans le navigateur de l'ordinateur. Les onglets que tu ne regardes pas sont mis en veille par le navigateur et affichent « Connexion perdue » au bout d'un moment : c'</w:t>
+      </w:r>
+      <w:r>
+        <w:t>est normal, ils se reconnectent sous le bon prénom dès que tu reviens dessus.</w:t>
       </w:r>
     </w:p>
     <w:sectPr>
@@ -3769,9 +4178,9 @@
 <file path=word/numbering.xml><?xml version="1.0" encoding="utf-8"?>
 <w:numbering xmlns:wpc="http://schemas.microsoft.com/office/word/2010/wordprocessingCanvas" xmlns:cx="http://schemas.microsoft.com/office/drawing/2014/chartex" xmlns:cx1="http://schemas.microsoft.com/office/drawing/2015/9/8/chartex" xmlns:cx2="http://schemas.microsoft.com/office/drawing/2015/10/21/chartex" xmlns:cx3="http://schemas.microsoft.com/office/drawing/2016/5/9/chartex" xmlns:cx4="http://schemas.microsoft.com/office/drawing/2016/5/10/chartex" xmlns:cx5="http://schemas.microsoft.com/office/drawing/2016/5/11/chartex" xmlns:cx6="http://schemas.microsoft.com/office/drawing/2016/5/12/chartex" xmlns:cx7="http://schemas.microsoft.com/office/drawing/2016/5/13/chartex" xmlns:cx8="http://schemas.microsoft.com/office/drawing/2016/5/14/chartex" xmlns:mc="http://schemas.openxmlformats.org/markup-compatibility/2006" xmlns:aink="http://schemas.microsoft.com/office/drawing/2016/ink" xmlns:am3d="http://schemas.microsoft.com/office/drawing/2017/model3d" xmlns:o="urn:schemas-microsoft-com:office:office" xmlns:oel="http://schemas.microsoft.com/office/2019/extlst" xmlns:r="http://schemas.openxmlformats.org/officeDocument/2006/relationships" xmlns:m="http://schemas.openxmlformats.org/officeDocument/2006/math" xmlns:v="urn:schemas-microsoft-com:vml" xmlns:wp14="http://schemas.microsoft.com/office/word/2010/wordprocessingDrawing" xmlns:wp="http://schemas.openxmlformats.org/drawingml/2006/wordprocessingDrawing" xmlns:w10="urn:schemas-microsoft-com:office:word" xmlns:w="http://schemas.openxmlformats.org/wordprocessingml/2006/main" xmlns:w14="http://schemas.microsoft.com/office/word/2010/wordml" xmlns:w15="http://schemas.microsoft.com/office/word/2012/wordml" xmlns:w16cex="http://schemas.microsoft.com/office/word/2018/wordml/cex" xmlns:w16cid="http://schemas.microsoft.com/office/word/2016/wordml/cid" xmlns:w16="http://schemas.microsoft.com/office/word/2018/wordml" xmlns:w16du="http://schemas.microsoft.com/office/word/2023/wordml/word16du" xmlns:w16sdtdh="http://schemas.microsoft.com/office/word/2020/wordml/sdtdatahash" xmlns:w16sdtfl="http://schemas.microsoft.com/office/word/2024/wordml/sdtformatlock" xmlns:w16se="http://schemas.microsoft.com/office/word/2015/wordml/symex" xmlns:wpg="http://schemas.microsoft.com/office/word/2010/wordprocessingGroup" xmlns:wpi="http://schemas.microsoft.com/office/word/2010/wordprocessingInk" xmlns:wne="http://schemas.microsoft.com/office/word/2006/wordml" xmlns:wps="http://schemas.microsoft.com/office/word/2010/wordprocessingShape" mc:Ignorable="w14 w15 w16se w16cid w16 w16cex w16sdtdh w16sdtfl w16du wp14">
   <w:abstractNum w:abstractNumId="0" w15:restartNumberingAfterBreak="0">
-    <w:nsid w:val="24796571"/>
+    <w:nsid w:val="02645253"/>
     <w:multiLevelType w:val="multilevel"/>
-    <w:tmpl w:val="DB165BCA"/>
+    <w:tmpl w:val="530A1C10"/>
     <w:lvl w:ilvl="0">
       <w:start w:val="1"/>
       <w:numFmt w:val="bullet"/>
@@ -3918,9 +4327,9 @@
     </w:lvl>
   </w:abstractNum>
   <w:abstractNum w:abstractNumId="1" w15:restartNumberingAfterBreak="0">
-    <w:nsid w:val="41A22CC0"/>
+    <w:nsid w:val="1B751B32"/>
     <w:multiLevelType w:val="multilevel"/>
-    <w:tmpl w:val="E0D00C5C"/>
+    <w:tmpl w:val="11A0633E"/>
     <w:lvl w:ilvl="0">
       <w:start w:val="1"/>
       <w:numFmt w:val="bullet"/>
@@ -4067,9 +4476,9 @@
     </w:lvl>
   </w:abstractNum>
   <w:abstractNum w:abstractNumId="2" w15:restartNumberingAfterBreak="0">
-    <w:nsid w:val="439E51C9"/>
+    <w:nsid w:val="26861A75"/>
     <w:multiLevelType w:val="multilevel"/>
-    <w:tmpl w:val="A01825F2"/>
+    <w:tmpl w:val="51A80216"/>
     <w:lvl w:ilvl="0">
       <w:start w:val="1"/>
       <w:numFmt w:val="bullet"/>
@@ -4216,9 +4625,9 @@
     </w:lvl>
   </w:abstractNum>
   <w:abstractNum w:abstractNumId="3" w15:restartNumberingAfterBreak="0">
-    <w:nsid w:val="53C15AB1"/>
+    <w:nsid w:val="295E2988"/>
     <w:multiLevelType w:val="multilevel"/>
-    <w:tmpl w:val="E474F0CE"/>
+    <w:tmpl w:val="22D6C884"/>
     <w:lvl w:ilvl="0">
       <w:start w:val="1"/>
       <w:numFmt w:val="bullet"/>
@@ -4235,7 +4644,7 @@
         <w:sz w:val="20"/>
       </w:rPr>
     </w:lvl>
-    <w:lvl w:ilvl="1">
+    <w:lvl w:ilvl="1" w:tentative="1">
       <w:start w:val="1"/>
       <w:numFmt w:val="bullet"/>
       <w:lvlText w:val="o"/>
@@ -4365,9 +4774,9 @@
     </w:lvl>
   </w:abstractNum>
   <w:abstractNum w:abstractNumId="4" w15:restartNumberingAfterBreak="0">
-    <w:nsid w:val="547F51C0"/>
+    <w:nsid w:val="511F540E"/>
     <w:multiLevelType w:val="multilevel"/>
-    <w:tmpl w:val="D076DCD0"/>
+    <w:tmpl w:val="CFEAF9D0"/>
     <w:lvl w:ilvl="0">
       <w:start w:val="1"/>
       <w:numFmt w:val="bullet"/>
@@ -4514,9 +4923,9 @@
     </w:lvl>
   </w:abstractNum>
   <w:abstractNum w:abstractNumId="5" w15:restartNumberingAfterBreak="0">
-    <w:nsid w:val="54C83D6A"/>
+    <w:nsid w:val="55072A59"/>
     <w:multiLevelType w:val="multilevel"/>
-    <w:tmpl w:val="8B1AEBE8"/>
+    <w:tmpl w:val="8C540416"/>
     <w:lvl w:ilvl="0">
       <w:start w:val="1"/>
       <w:numFmt w:val="bullet"/>
@@ -4663,9 +5072,9 @@
     </w:lvl>
   </w:abstractNum>
   <w:abstractNum w:abstractNumId="6" w15:restartNumberingAfterBreak="0">
-    <w:nsid w:val="67C84092"/>
+    <w:nsid w:val="5704739D"/>
     <w:multiLevelType w:val="multilevel"/>
-    <w:tmpl w:val="C05AD152"/>
+    <w:tmpl w:val="180855FC"/>
     <w:lvl w:ilvl="0">
       <w:start w:val="1"/>
       <w:numFmt w:val="bullet"/>
@@ -4812,13 +5221,13 @@
     </w:lvl>
   </w:abstractNum>
   <w:abstractNum w:abstractNumId="7" w15:restartNumberingAfterBreak="0">
-    <w:nsid w:val="6CC043A7"/>
+    <w:nsid w:val="5B09285C"/>
     <w:multiLevelType w:val="multilevel"/>
-    <w:tmpl w:val="359ACABE"/>
+    <w:tmpl w:val="3ADC54F0"/>
     <w:lvl w:ilvl="0">
       <w:start w:val="1"/>
-      <w:numFmt w:val="bullet"/>
-      <w:lvlText w:val=""/>
+      <w:numFmt w:val="decimal"/>
+      <w:lvlText w:val="%1."/>
       <w:lvlJc w:val="left"/>
       <w:pPr>
         <w:tabs>
@@ -4826,15 +5235,11 @@
         </w:tabs>
         <w:ind w:left="720" w:hanging="360"/>
       </w:pPr>
-      <w:rPr>
-        <w:rFonts w:ascii="Symbol" w:hAnsi="Symbol" w:hint="default"/>
-        <w:sz w:val="20"/>
-      </w:rPr>
     </w:lvl>
     <w:lvl w:ilvl="1" w:tentative="1">
       <w:start w:val="1"/>
-      <w:numFmt w:val="bullet"/>
-      <w:lvlText w:val="o"/>
+      <w:numFmt w:val="decimal"/>
+      <w:lvlText w:val="%2."/>
       <w:lvlJc w:val="left"/>
       <w:pPr>
         <w:tabs>
@@ -4842,15 +5247,11 @@
         </w:tabs>
         <w:ind w:left="1440" w:hanging="360"/>
       </w:pPr>
-      <w:rPr>
-        <w:rFonts w:ascii="Courier New" w:hAnsi="Courier New" w:hint="default"/>
-        <w:sz w:val="20"/>
-      </w:rPr>
     </w:lvl>
     <w:lvl w:ilvl="2" w:tentative="1">
       <w:start w:val="1"/>
-      <w:numFmt w:val="bullet"/>
-      <w:lvlText w:val=""/>
+      <w:numFmt w:val="decimal"/>
+      <w:lvlText w:val="%3."/>
       <w:lvlJc w:val="left"/>
       <w:pPr>
         <w:tabs>
@@ -4858,15 +5259,11 @@
         </w:tabs>
         <w:ind w:left="2160" w:hanging="360"/>
       </w:pPr>
-      <w:rPr>
-        <w:rFonts w:ascii="Wingdings" w:hAnsi="Wingdings" w:hint="default"/>
-        <w:sz w:val="20"/>
-      </w:rPr>
     </w:lvl>
     <w:lvl w:ilvl="3" w:tentative="1">
       <w:start w:val="1"/>
-      <w:numFmt w:val="bullet"/>
-      <w:lvlText w:val=""/>
+      <w:numFmt w:val="decimal"/>
+      <w:lvlText w:val="%4."/>
       <w:lvlJc w:val="left"/>
       <w:pPr>
         <w:tabs>
@@ -4874,15 +5271,11 @@
         </w:tabs>
         <w:ind w:left="2880" w:hanging="360"/>
       </w:pPr>
-      <w:rPr>
-        <w:rFonts w:ascii="Wingdings" w:hAnsi="Wingdings" w:hint="default"/>
-        <w:sz w:val="20"/>
-      </w:rPr>
     </w:lvl>
     <w:lvl w:ilvl="4" w:tentative="1">
       <w:start w:val="1"/>
-      <w:numFmt w:val="bullet"/>
-      <w:lvlText w:val=""/>
+      <w:numFmt w:val="decimal"/>
+      <w:lvlText w:val="%5."/>
       <w:lvlJc w:val="left"/>
       <w:pPr>
         <w:tabs>
@@ -4890,15 +5283,11 @@
         </w:tabs>
         <w:ind w:left="3600" w:hanging="360"/>
       </w:pPr>
-      <w:rPr>
-        <w:rFonts w:ascii="Wingdings" w:hAnsi="Wingdings" w:hint="default"/>
-        <w:sz w:val="20"/>
-      </w:rPr>
     </w:lvl>
     <w:lvl w:ilvl="5" w:tentative="1">
       <w:start w:val="1"/>
-      <w:numFmt w:val="bullet"/>
-      <w:lvlText w:val=""/>
+      <w:numFmt w:val="decimal"/>
+      <w:lvlText w:val="%6."/>
       <w:lvlJc w:val="left"/>
       <w:pPr>
         <w:tabs>
@@ -4906,15 +5295,11 @@
         </w:tabs>
         <w:ind w:left="4320" w:hanging="360"/>
       </w:pPr>
-      <w:rPr>
-        <w:rFonts w:ascii="Wingdings" w:hAnsi="Wingdings" w:hint="default"/>
-        <w:sz w:val="20"/>
-      </w:rPr>
     </w:lvl>
     <w:lvl w:ilvl="6" w:tentative="1">
       <w:start w:val="1"/>
-      <w:numFmt w:val="bullet"/>
-      <w:lvlText w:val=""/>
+      <w:numFmt w:val="decimal"/>
+      <w:lvlText w:val="%7."/>
       <w:lvlJc w:val="left"/>
       <w:pPr>
         <w:tabs>
@@ -4922,15 +5307,11 @@
         </w:tabs>
         <w:ind w:left="5040" w:hanging="360"/>
       </w:pPr>
-      <w:rPr>
-        <w:rFonts w:ascii="Wingdings" w:hAnsi="Wingdings" w:hint="default"/>
-        <w:sz w:val="20"/>
-      </w:rPr>
     </w:lvl>
     <w:lvl w:ilvl="7" w:tentative="1">
       <w:start w:val="1"/>
-      <w:numFmt w:val="bullet"/>
-      <w:lvlText w:val=""/>
+      <w:numFmt w:val="decimal"/>
+      <w:lvlText w:val="%8."/>
       <w:lvlJc w:val="left"/>
       <w:pPr>
         <w:tabs>
@@ -4938,15 +5319,11 @@
         </w:tabs>
         <w:ind w:left="5760" w:hanging="360"/>
       </w:pPr>
-      <w:rPr>
-        <w:rFonts w:ascii="Wingdings" w:hAnsi="Wingdings" w:hint="default"/>
-        <w:sz w:val="20"/>
-      </w:rPr>
     </w:lvl>
     <w:lvl w:ilvl="8" w:tentative="1">
       <w:start w:val="1"/>
-      <w:numFmt w:val="bullet"/>
-      <w:lvlText w:val=""/>
+      <w:numFmt w:val="decimal"/>
+      <w:lvlText w:val="%9."/>
       <w:lvlJc w:val="left"/>
       <w:pPr>
         <w:tabs>
@@ -4954,20 +5331,16 @@
         </w:tabs>
         <w:ind w:left="6480" w:hanging="360"/>
       </w:pPr>
-      <w:rPr>
-        <w:rFonts w:ascii="Wingdings" w:hAnsi="Wingdings" w:hint="default"/>
-        <w:sz w:val="20"/>
-      </w:rPr>
     </w:lvl>
   </w:abstractNum>
   <w:abstractNum w:abstractNumId="8" w15:restartNumberingAfterBreak="0">
-    <w:nsid w:val="736B23FE"/>
+    <w:nsid w:val="64C825D0"/>
     <w:multiLevelType w:val="multilevel"/>
-    <w:tmpl w:val="16A638FE"/>
+    <w:tmpl w:val="94EA8148"/>
     <w:lvl w:ilvl="0">
       <w:start w:val="1"/>
-      <w:numFmt w:val="decimal"/>
-      <w:lvlText w:val="%1."/>
+      <w:numFmt w:val="bullet"/>
+      <w:lvlText w:val=""/>
       <w:lvlJc w:val="left"/>
       <w:pPr>
         <w:tabs>
@@ -4975,11 +5348,164 @@
         </w:tabs>
         <w:ind w:left="720" w:hanging="360"/>
       </w:pPr>
+      <w:rPr>
+        <w:rFonts w:ascii="Symbol" w:hAnsi="Symbol" w:hint="default"/>
+        <w:sz w:val="20"/>
+      </w:rPr>
+    </w:lvl>
+    <w:lvl w:ilvl="1">
+      <w:start w:val="1"/>
+      <w:numFmt w:val="bullet"/>
+      <w:lvlText w:val="o"/>
+      <w:lvlJc w:val="left"/>
+      <w:pPr>
+        <w:tabs>
+          <w:tab w:val="num" w:pos="1440"/>
+        </w:tabs>
+        <w:ind w:left="1440" w:hanging="360"/>
+      </w:pPr>
+      <w:rPr>
+        <w:rFonts w:ascii="Courier New" w:hAnsi="Courier New" w:hint="default"/>
+        <w:sz w:val="20"/>
+      </w:rPr>
+    </w:lvl>
+    <w:lvl w:ilvl="2" w:tentative="1">
+      <w:start w:val="1"/>
+      <w:numFmt w:val="bullet"/>
+      <w:lvlText w:val=""/>
+      <w:lvlJc w:val="left"/>
+      <w:pPr>
+        <w:tabs>
+          <w:tab w:val="num" w:pos="2160"/>
+        </w:tabs>
+        <w:ind w:left="2160" w:hanging="360"/>
+      </w:pPr>
+      <w:rPr>
+        <w:rFonts w:ascii="Wingdings" w:hAnsi="Wingdings" w:hint="default"/>
+        <w:sz w:val="20"/>
+      </w:rPr>
+    </w:lvl>
+    <w:lvl w:ilvl="3" w:tentative="1">
+      <w:start w:val="1"/>
+      <w:numFmt w:val="bullet"/>
+      <w:lvlText w:val=""/>
+      <w:lvlJc w:val="left"/>
+      <w:pPr>
+        <w:tabs>
+          <w:tab w:val="num" w:pos="2880"/>
+        </w:tabs>
+        <w:ind w:left="2880" w:hanging="360"/>
+      </w:pPr>
+      <w:rPr>
+        <w:rFonts w:ascii="Wingdings" w:hAnsi="Wingdings" w:hint="default"/>
+        <w:sz w:val="20"/>
+      </w:rPr>
+    </w:lvl>
+    <w:lvl w:ilvl="4" w:tentative="1">
+      <w:start w:val="1"/>
+      <w:numFmt w:val="bullet"/>
+      <w:lvlText w:val=""/>
+      <w:lvlJc w:val="left"/>
+      <w:pPr>
+        <w:tabs>
+          <w:tab w:val="num" w:pos="3600"/>
+        </w:tabs>
+        <w:ind w:left="3600" w:hanging="360"/>
+      </w:pPr>
+      <w:rPr>
+        <w:rFonts w:ascii="Wingdings" w:hAnsi="Wingdings" w:hint="default"/>
+        <w:sz w:val="20"/>
+      </w:rPr>
+    </w:lvl>
+    <w:lvl w:ilvl="5" w:tentative="1">
+      <w:start w:val="1"/>
+      <w:numFmt w:val="bullet"/>
+      <w:lvlText w:val=""/>
+      <w:lvlJc w:val="left"/>
+      <w:pPr>
+        <w:tabs>
+          <w:tab w:val="num" w:pos="4320"/>
+        </w:tabs>
+        <w:ind w:left="4320" w:hanging="360"/>
+      </w:pPr>
+      <w:rPr>
+        <w:rFonts w:ascii="Wingdings" w:hAnsi="Wingdings" w:hint="default"/>
+        <w:sz w:val="20"/>
+      </w:rPr>
+    </w:lvl>
+    <w:lvl w:ilvl="6" w:tentative="1">
+      <w:start w:val="1"/>
+      <w:numFmt w:val="bullet"/>
+      <w:lvlText w:val=""/>
+      <w:lvlJc w:val="left"/>
+      <w:pPr>
+        <w:tabs>
+          <w:tab w:val="num" w:pos="5040"/>
+        </w:tabs>
+        <w:ind w:left="5040" w:hanging="360"/>
+      </w:pPr>
+      <w:rPr>
+        <w:rFonts w:ascii="Wingdings" w:hAnsi="Wingdings" w:hint="default"/>
+        <w:sz w:val="20"/>
+      </w:rPr>
+    </w:lvl>
+    <w:lvl w:ilvl="7" w:tentative="1">
+      <w:start w:val="1"/>
+      <w:numFmt w:val="bullet"/>
+      <w:lvlText w:val=""/>
+      <w:lvlJc w:val="left"/>
+      <w:pPr>
+        <w:tabs>
+          <w:tab w:val="num" w:pos="5760"/>
+        </w:tabs>
+        <w:ind w:left="5760" w:hanging="360"/>
+      </w:pPr>
+      <w:rPr>
+        <w:rFonts w:ascii="Wingdings" w:hAnsi="Wingdings" w:hint="default"/>
+        <w:sz w:val="20"/>
+      </w:rPr>
+    </w:lvl>
+    <w:lvl w:ilvl="8" w:tentative="1">
+      <w:start w:val="1"/>
+      <w:numFmt w:val="bullet"/>
+      <w:lvlText w:val=""/>
+      <w:lvlJc w:val="left"/>
+      <w:pPr>
+        <w:tabs>
+          <w:tab w:val="num" w:pos="6480"/>
+        </w:tabs>
+        <w:ind w:left="6480" w:hanging="360"/>
+      </w:pPr>
+      <w:rPr>
+        <w:rFonts w:ascii="Wingdings" w:hAnsi="Wingdings" w:hint="default"/>
+        <w:sz w:val="20"/>
+      </w:rPr>
+    </w:lvl>
+  </w:abstractNum>
+  <w:abstractNum w:abstractNumId="9" w15:restartNumberingAfterBreak="0">
+    <w:nsid w:val="6D756C4B"/>
+    <w:multiLevelType w:val="multilevel"/>
+    <w:tmpl w:val="8B362D10"/>
+    <w:lvl w:ilvl="0">
+      <w:start w:val="1"/>
+      <w:numFmt w:val="bullet"/>
+      <w:lvlText w:val=""/>
+      <w:lvlJc w:val="left"/>
+      <w:pPr>
+        <w:tabs>
+          <w:tab w:val="num" w:pos="720"/>
+        </w:tabs>
+        <w:ind w:left="720" w:hanging="360"/>
+      </w:pPr>
+      <w:rPr>
+        <w:rFonts w:ascii="Symbol" w:hAnsi="Symbol" w:hint="default"/>
+        <w:sz w:val="20"/>
+      </w:rPr>
     </w:lvl>
     <w:lvl w:ilvl="1" w:tentative="1">
       <w:start w:val="1"/>
-      <w:numFmt w:val="decimal"/>
-      <w:lvlText w:val="%2."/>
+      <w:numFmt w:val="bullet"/>
+      <w:lvlText w:val="o"/>
       <w:lvlJc w:val="left"/>
       <w:pPr>
         <w:tabs>
@@ -4987,11 +5513,15 @@
         </w:tabs>
         <w:ind w:left="1440" w:hanging="360"/>
       </w:pPr>
+      <w:rPr>
+        <w:rFonts w:ascii="Courier New" w:hAnsi="Courier New" w:hint="default"/>
+        <w:sz w:val="20"/>
+      </w:rPr>
     </w:lvl>
     <w:lvl w:ilvl="2" w:tentative="1">
       <w:start w:val="1"/>
-      <w:numFmt w:val="decimal"/>
-      <w:lvlText w:val="%3."/>
+      <w:numFmt w:val="bullet"/>
+      <w:lvlText w:val=""/>
       <w:lvlJc w:val="left"/>
       <w:pPr>
         <w:tabs>
@@ -4999,11 +5529,15 @@
         </w:tabs>
         <w:ind w:left="2160" w:hanging="360"/>
       </w:pPr>
+      <w:rPr>
+        <w:rFonts w:ascii="Wingdings" w:hAnsi="Wingdings" w:hint="default"/>
+        <w:sz w:val="20"/>
+      </w:rPr>
     </w:lvl>
     <w:lvl w:ilvl="3" w:tentative="1">
       <w:start w:val="1"/>
-      <w:numFmt w:val="decimal"/>
-      <w:lvlText w:val="%4."/>
+      <w:numFmt w:val="bullet"/>
+      <w:lvlText w:val=""/>
       <w:lvlJc w:val="left"/>
       <w:pPr>
         <w:tabs>
@@ -5011,11 +5545,15 @@
         </w:tabs>
         <w:ind w:left="2880" w:hanging="360"/>
       </w:pPr>
+      <w:rPr>
+        <w:rFonts w:ascii="Wingdings" w:hAnsi="Wingdings" w:hint="default"/>
+        <w:sz w:val="20"/>
+      </w:rPr>
     </w:lvl>
     <w:lvl w:ilvl="4" w:tentative="1">
       <w:start w:val="1"/>
-      <w:numFmt w:val="decimal"/>
-      <w:lvlText w:val="%5."/>
+      <w:numFmt w:val="bullet"/>
+      <w:lvlText w:val=""/>
       <w:lvlJc w:val="left"/>
       <w:pPr>
         <w:tabs>
@@ -5023,11 +5561,15 @@
         </w:tabs>
         <w:ind w:left="3600" w:hanging="360"/>
       </w:pPr>
+      <w:rPr>
+        <w:rFonts w:ascii="Wingdings" w:hAnsi="Wingdings" w:hint="default"/>
+        <w:sz w:val="20"/>
+      </w:rPr>
     </w:lvl>
     <w:lvl w:ilvl="5" w:tentative="1">
       <w:start w:val="1"/>
-      <w:numFmt w:val="decimal"/>
-      <w:lvlText w:val="%6."/>
+      <w:numFmt w:val="bullet"/>
+      <w:lvlText w:val=""/>
       <w:lvlJc w:val="left"/>
       <w:pPr>
         <w:tabs>
@@ -5035,11 +5577,15 @@
         </w:tabs>
         <w:ind w:left="4320" w:hanging="360"/>
       </w:pPr>
+      <w:rPr>
+        <w:rFonts w:ascii="Wingdings" w:hAnsi="Wingdings" w:hint="default"/>
+        <w:sz w:val="20"/>
+      </w:rPr>
     </w:lvl>
     <w:lvl w:ilvl="6" w:tentative="1">
       <w:start w:val="1"/>
-      <w:numFmt w:val="decimal"/>
-      <w:lvlText w:val="%7."/>
+      <w:numFmt w:val="bullet"/>
+      <w:lvlText w:val=""/>
       <w:lvlJc w:val="left"/>
       <w:pPr>
         <w:tabs>
@@ -5047,11 +5593,15 @@
         </w:tabs>
         <w:ind w:left="5040" w:hanging="360"/>
       </w:pPr>
+      <w:rPr>
+        <w:rFonts w:ascii="Wingdings" w:hAnsi="Wingdings" w:hint="default"/>
+        <w:sz w:val="20"/>
+      </w:rPr>
     </w:lvl>
     <w:lvl w:ilvl="7" w:tentative="1">
       <w:start w:val="1"/>
-      <w:numFmt w:val="decimal"/>
-      <w:lvlText w:val="%8."/>
+      <w:numFmt w:val="bullet"/>
+      <w:lvlText w:val=""/>
       <w:lvlJc w:val="left"/>
       <w:pPr>
         <w:tabs>
@@ -5059,11 +5609,15 @@
         </w:tabs>
         <w:ind w:left="5760" w:hanging="360"/>
       </w:pPr>
+      <w:rPr>
+        <w:rFonts w:ascii="Wingdings" w:hAnsi="Wingdings" w:hint="default"/>
+        <w:sz w:val="20"/>
+      </w:rPr>
     </w:lvl>
     <w:lvl w:ilvl="8" w:tentative="1">
       <w:start w:val="1"/>
-      <w:numFmt w:val="decimal"/>
-      <w:lvlText w:val="%9."/>
+      <w:numFmt w:val="bullet"/>
+      <w:lvlText w:val=""/>
       <w:lvlJc w:val="left"/>
       <w:pPr>
         <w:tabs>
@@ -5071,34 +5625,193 @@
         </w:tabs>
         <w:ind w:left="6480" w:hanging="360"/>
       </w:pPr>
+      <w:rPr>
+        <w:rFonts w:ascii="Wingdings" w:hAnsi="Wingdings" w:hint="default"/>
+        <w:sz w:val="20"/>
+      </w:rPr>
     </w:lvl>
   </w:abstractNum>
-  <w:num w:numId="1" w16cid:durableId="1949771904">
+  <w:abstractNum w:abstractNumId="10" w15:restartNumberingAfterBreak="0">
+    <w:nsid w:val="71063922"/>
+    <w:multiLevelType w:val="multilevel"/>
+    <w:tmpl w:val="F4D66DF2"/>
+    <w:lvl w:ilvl="0">
+      <w:start w:val="1"/>
+      <w:numFmt w:val="bullet"/>
+      <w:lvlText w:val=""/>
+      <w:lvlJc w:val="left"/>
+      <w:pPr>
+        <w:tabs>
+          <w:tab w:val="num" w:pos="720"/>
+        </w:tabs>
+        <w:ind w:left="720" w:hanging="360"/>
+      </w:pPr>
+      <w:rPr>
+        <w:rFonts w:ascii="Symbol" w:hAnsi="Symbol" w:hint="default"/>
+        <w:sz w:val="20"/>
+      </w:rPr>
+    </w:lvl>
+    <w:lvl w:ilvl="1" w:tentative="1">
+      <w:start w:val="1"/>
+      <w:numFmt w:val="bullet"/>
+      <w:lvlText w:val="o"/>
+      <w:lvlJc w:val="left"/>
+      <w:pPr>
+        <w:tabs>
+          <w:tab w:val="num" w:pos="1440"/>
+        </w:tabs>
+        <w:ind w:left="1440" w:hanging="360"/>
+      </w:pPr>
+      <w:rPr>
+        <w:rFonts w:ascii="Courier New" w:hAnsi="Courier New" w:hint="default"/>
+        <w:sz w:val="20"/>
+      </w:rPr>
+    </w:lvl>
+    <w:lvl w:ilvl="2" w:tentative="1">
+      <w:start w:val="1"/>
+      <w:numFmt w:val="bullet"/>
+      <w:lvlText w:val=""/>
+      <w:lvlJc w:val="left"/>
+      <w:pPr>
+        <w:tabs>
+          <w:tab w:val="num" w:pos="2160"/>
+        </w:tabs>
+        <w:ind w:left="2160" w:hanging="360"/>
+      </w:pPr>
+      <w:rPr>
+        <w:rFonts w:ascii="Wingdings" w:hAnsi="Wingdings" w:hint="default"/>
+        <w:sz w:val="20"/>
+      </w:rPr>
+    </w:lvl>
+    <w:lvl w:ilvl="3" w:tentative="1">
+      <w:start w:val="1"/>
+      <w:numFmt w:val="bullet"/>
+      <w:lvlText w:val=""/>
+      <w:lvlJc w:val="left"/>
+      <w:pPr>
+        <w:tabs>
+          <w:tab w:val="num" w:pos="2880"/>
+        </w:tabs>
+        <w:ind w:left="2880" w:hanging="360"/>
+      </w:pPr>
+      <w:rPr>
+        <w:rFonts w:ascii="Wingdings" w:hAnsi="Wingdings" w:hint="default"/>
+        <w:sz w:val="20"/>
+      </w:rPr>
+    </w:lvl>
+    <w:lvl w:ilvl="4" w:tentative="1">
+      <w:start w:val="1"/>
+      <w:numFmt w:val="bullet"/>
+      <w:lvlText w:val=""/>
+      <w:lvlJc w:val="left"/>
+      <w:pPr>
+        <w:tabs>
+          <w:tab w:val="num" w:pos="3600"/>
+        </w:tabs>
+        <w:ind w:left="3600" w:hanging="360"/>
+      </w:pPr>
+      <w:rPr>
+        <w:rFonts w:ascii="Wingdings" w:hAnsi="Wingdings" w:hint="default"/>
+        <w:sz w:val="20"/>
+      </w:rPr>
+    </w:lvl>
+    <w:lvl w:ilvl="5" w:tentative="1">
+      <w:start w:val="1"/>
+      <w:numFmt w:val="bullet"/>
+      <w:lvlText w:val=""/>
+      <w:lvlJc w:val="left"/>
+      <w:pPr>
+        <w:tabs>
+          <w:tab w:val="num" w:pos="4320"/>
+        </w:tabs>
+        <w:ind w:left="4320" w:hanging="360"/>
+      </w:pPr>
+      <w:rPr>
+        <w:rFonts w:ascii="Wingdings" w:hAnsi="Wingdings" w:hint="default"/>
+        <w:sz w:val="20"/>
+      </w:rPr>
+    </w:lvl>
+    <w:lvl w:ilvl="6" w:tentative="1">
+      <w:start w:val="1"/>
+      <w:numFmt w:val="bullet"/>
+      <w:lvlText w:val=""/>
+      <w:lvlJc w:val="left"/>
+      <w:pPr>
+        <w:tabs>
+          <w:tab w:val="num" w:pos="5040"/>
+        </w:tabs>
+        <w:ind w:left="5040" w:hanging="360"/>
+      </w:pPr>
+      <w:rPr>
+        <w:rFonts w:ascii="Wingdings" w:hAnsi="Wingdings" w:hint="default"/>
+        <w:sz w:val="20"/>
+      </w:rPr>
+    </w:lvl>
+    <w:lvl w:ilvl="7" w:tentative="1">
+      <w:start w:val="1"/>
+      <w:numFmt w:val="bullet"/>
+      <w:lvlText w:val=""/>
+      <w:lvlJc w:val="left"/>
+      <w:pPr>
+        <w:tabs>
+          <w:tab w:val="num" w:pos="5760"/>
+        </w:tabs>
+        <w:ind w:left="5760" w:hanging="360"/>
+      </w:pPr>
+      <w:rPr>
+        <w:rFonts w:ascii="Wingdings" w:hAnsi="Wingdings" w:hint="default"/>
+        <w:sz w:val="20"/>
+      </w:rPr>
+    </w:lvl>
+    <w:lvl w:ilvl="8" w:tentative="1">
+      <w:start w:val="1"/>
+      <w:numFmt w:val="bullet"/>
+      <w:lvlText w:val=""/>
+      <w:lvlJc w:val="left"/>
+      <w:pPr>
+        <w:tabs>
+          <w:tab w:val="num" w:pos="6480"/>
+        </w:tabs>
+        <w:ind w:left="6480" w:hanging="360"/>
+      </w:pPr>
+      <w:rPr>
+        <w:rFonts w:ascii="Wingdings" w:hAnsi="Wingdings" w:hint="default"/>
+        <w:sz w:val="20"/>
+      </w:rPr>
+    </w:lvl>
+  </w:abstractNum>
+  <w:num w:numId="1" w16cid:durableId="170415983">
     <w:abstractNumId w:val="0"/>
   </w:num>
-  <w:num w:numId="2" w16cid:durableId="1806655122">
+  <w:num w:numId="2" w16cid:durableId="1884904729">
+    <w:abstractNumId w:val="7"/>
+  </w:num>
+  <w:num w:numId="3" w16cid:durableId="514929725">
     <w:abstractNumId w:val="8"/>
   </w:num>
-  <w:num w:numId="3" w16cid:durableId="1616787484">
-    <w:abstractNumId w:val="3"/>
+  <w:num w:numId="4" w16cid:durableId="847252765">
+    <w:abstractNumId w:val="4"/>
   </w:num>
-  <w:num w:numId="4" w16cid:durableId="1435058308">
+  <w:num w:numId="5" w16cid:durableId="138768327">
+    <w:abstractNumId w:val="5"/>
+  </w:num>
+  <w:num w:numId="6" w16cid:durableId="1057702880">
+    <w:abstractNumId w:val="10"/>
+  </w:num>
+  <w:num w:numId="7" w16cid:durableId="779683226">
+    <w:abstractNumId w:val="2"/>
+  </w:num>
+  <w:num w:numId="8" w16cid:durableId="1717194933">
     <w:abstractNumId w:val="1"/>
   </w:num>
-  <w:num w:numId="5" w16cid:durableId="1866752258">
-    <w:abstractNumId w:val="5"/>
+  <w:num w:numId="9" w16cid:durableId="522793575">
+    <w:abstractNumId w:val="9"/>
   </w:num>
-  <w:num w:numId="6" w16cid:durableId="1740664278">
-    <w:abstractNumId w:val="4"/>
+  <w:num w:numId="10" w16cid:durableId="295451682">
+    <w:abstractNumId w:val="6"/>
   </w:num>
-  <w:num w:numId="7" w16cid:durableId="704061042">
-    <w:abstractNumId w:val="7"/>
-  </w:num>
-  <w:num w:numId="8" w16cid:durableId="423720833">
-    <w:abstractNumId w:val="2"/>
-  </w:num>
-  <w:num w:numId="9" w16cid:durableId="1953852959">
-    <w:abstractNumId w:val="6"/>
+  <w:num w:numId="11" w16cid:durableId="273445455">
+    <w:abstractNumId w:val="3"/>
   </w:num>
 </w:numbering>
 </file>

</xml_diff>